<commit_message>
fix(genre): stale Workshop-3 naming in lab file, Module N refs in CLIENT.md
vault-standup-notes.txt/.docx said "Workshop 3" in P. Chen's stand-up note;
now "Day 2". Regenerated all four lab .docx via convert-lab-files.py and
re-ran generate-hashes.mjs — escape-room/config/ shows no diff, so no unlock
code moved. Also brought CLIENT.md's later-section curriculum mapping
(§5, §6, §8) from Module 2/3/4 onto the Day 1/2/3 naming §0 already uses.

Co-Authored-By: Claude Fable 5 <noreply@anthropic.com>
</commit_message>
<xml_diff>
--- a/escape-room/lab-files/vault-standup-notes.docx
+++ b/escape-room/lab-files/vault-standup-notes.docx
@@ -173,12 +173,12 @@
         <w:pStyle w:val="ListBullet"/>
       </w:pPr>
       <w:r>
-        <w:t>The new Cowork rollout is on track; Workshop 3 is scheduled for this week</w:t>
+        <w:t>The new Cowork rollout is on track; Day 2 is scheduled for this week</w:t>
       </w:r>
     </w:p>
     <w:p>
       <w:r>
-        <w:t>ACTION: P. Chen — Distribute the Workshop 3 lab file pack to all participants before the session</w:t>
+        <w:t>ACTION: P. Chen — Distribute the Day 2 lab file pack to all participants before the session</w:t>
       </w:r>
     </w:p>
     <w:p/>

</xml_diff>